<commit_message>
feat(pa): highlight 1 parent meeting, 2 school board meetings, and Wai Kru day activity lead
- Add authentic evidence for Wai Kru Day activity (10-11 June 2569) under memo ศธ 04024.137/กง060/2569 & order 157/2569, lead by Kru James
- Add authentic evidence for 1 round of parent-teacher meeting (6 May 2569) under order 113/2569 with Kru James as MC
- Add authentic evidence for 2 rounds of School Basic Education Board meetings (Round 1: 20 Jan 2569, Round 2: 18 June 2569)
- Update Indicators 1.7, 1.8, 2.3, 2.4 in index.html, Canva slides, and docx report
- Update interactive ChatGPT Assistant chips and knowledge base with community & board meeting facts
</commit_message>
<xml_diff>
--- a/รายงานผลการพัฒนางาน PA 2569 นายอนันตชัย เพ็ชรรี่.docx
+++ b/รายงานผลการพัฒนางาน PA 2569 นายอนันตชัย เพ็ชรรี่.docx
@@ -1070,7 +1070,7 @@
               <w:rPr>
                 <w:sz w:val="26"/>
               </w:rPr>
-              <w:t>หัวหน้างาน ICT งานพัสดุและสินทรัพย์ และโครงการสัมพันธ์ชุมชน</w:t>
+              <w:t>หัวหน้างาน ICT ฝ่ายบริหารทั่วไป (TOR ป้ายรร.ใหม่/รับบริจาค) และสัมพันธ์ชุมชน</w:t>
             </w:r>
           </w:p>
         </w:tc>
@@ -1546,7 +1546,7 @@
               <w:rPr>
                 <w:sz w:val="26"/>
               </w:rPr>
-              <w:t>ดูแลห้องคอมพิวเตอร์ให้สะอาด ปลอดภัย และเอื้อต่อการเรียนรู้ร่วมกัน</w:t>
+              <w:t>ดูแลห้องคอมพิวเตอร์ให้สะอาด ปลอดภัย สายไฟลงราง 100% และเอื้อต่อการเรียนรู้ร่วมกัน</w:t>
             </w:r>
           </w:p>
         </w:tc>
@@ -1584,7 +1584,7 @@
               <w:rPr>
                 <w:sz w:val="26"/>
               </w:rPr>
-              <w:t>ปลูกฝังวินัย ความรับผิดชอบ การใช้อุปกรณ์ร่วมกัน และความปลอดภัยดิจิทัล</w:t>
+              <w:t>ผู้รับผิดชอบจัดกิจกรรมวันไหว้ครู 2569 ให้เด็ก (คำสั่ง 157/2569, บันทึก ศธ 04024.137/กง060/2569) ปลูกฝังความกตัญญูกตเวทิตา วินัย และพลเมืองดิจิทัล</w:t>
             </w:r>
           </w:p>
         </w:tc>
@@ -1794,7 +1794,7 @@
               <w:rPr>
                 <w:sz w:val="26"/>
               </w:rPr>
-              <w:t>ดำเนินงานครูประจำชั้น การรู้จักผู้เรียนรายบุคคล การคัดกรอง การช่วยเหลือ และการประสานผู้ปกครอง</w:t>
+              <w:t>ดำเนินงานครูประจำชั้น ม.3 การรู้จักผู้เรียนรายบุคคล เยี่ยมบ้าน 100% คัดกรอง SDQ และทุน กสศ.</w:t>
             </w:r>
           </w:p>
         </w:tc>
@@ -1830,7 +1830,7 @@
               <w:rPr>
                 <w:sz w:val="26"/>
               </w:rPr>
-              <w:t>ปฏิบัติหน้าที่หัวหน้างาน ICT ดูแลระบบเครือข่าย ห้องคอมพิวเตอร์ งานพัสดุและสินทรัพย์ตามที่ได้รับมอบหมาย</w:t>
+              <w:t>หัวหน้าฝ่าย ICT (เครือข่ายพร้อมใช้ 98.5%) และฝ่ายบริหารทั่วไป (TOR ป้ายรร.ใหม่ 8.6x3 ม., รับบริจาค 9,075 บาท, กองทุนแม่ของแผ่นดิน)</w:t>
             </w:r>
           </w:p>
         </w:tc>
@@ -1868,7 +1868,7 @@
               <w:rPr>
                 <w:sz w:val="26"/>
               </w:rPr>
-              <w:t>รับผิดชอบโครงการส่งเสริมความสัมพันธ์ชุมชน ประสานคณะกรรมการสถานศึกษา ผู้ปกครอง และภาคีเครือข่าย</w:t>
+              <w:t>จัดประชุมผู้ปกครอง 1 รอบ (6 พ.ค. 69), คณะกรรมการสถานศึกษา 2 รอบ (20 ม.ค. &amp; 18 มิ.ย. 69) และจัดกิจกรรมวันไหว้ครู 2569</w:t>
             </w:r>
           </w:p>
         </w:tc>
@@ -1890,7 +1890,7 @@
           <w:color w:val="8F1D2C"/>
           <w:sz w:val="36"/>
         </w:rPr>
-        <w:t>ผลการดำเนินงานโครงการสัมพันธ์ชุมชน</w:t>
+        <w:t>ผลการดำเนินงานโครงการสัมพันธ์ชุมชน &amp; ประชุมผู้ปกครอง 1 รอบ</w:t>
       </w:r>
     </w:p>
     <w:tbl>
@@ -1965,7 +1965,7 @@
               <w:rPr>
                 <w:sz w:val="26"/>
               </w:rPr>
-              <w:t>ผู้ตอบแบบประเมิน</w:t>
+              <w:t>การจัดประชุมผู้ปกครอง</w:t>
             </w:r>
           </w:p>
         </w:tc>
@@ -1982,7 +1982,7 @@
               <w:rPr>
                 <w:sz w:val="26"/>
               </w:rPr>
-              <w:t>80 คน</w:t>
+              <w:t>1 รอบ (ภาคเรียนที่ 1/2569 วันที่ 6 พฤษภาคม 2569 คำสั่ง 113/2569)</w:t>
             </w:r>
           </w:p>
         </w:tc>
@@ -2002,6 +2002,43 @@
               <w:rPr>
                 <w:sz w:val="26"/>
               </w:rPr>
+              <w:t>ผู้ตอบแบบประเมิน</w:t>
+            </w:r>
+          </w:p>
+        </w:tc>
+        <w:tc>
+          <w:tcPr>
+            <w:tcW w:type="dxa" w:w="6696"/>
+            <w:vAlign w:val="center"/>
+            <w:shd w:fill="F8EEF0"/>
+          </w:tcPr>
+          <w:p>
+            <w:pPr>
+              <w:spacing w:after="40" w:before="40"/>
+            </w:pPr>
+            <w:r>
+              <w:rPr>
+                <w:sz w:val="26"/>
+              </w:rPr>
+              <w:t>80 คน (ร้อยละ 100)</w:t>
+            </w:r>
+          </w:p>
+        </w:tc>
+      </w:tr>
+      <w:tr>
+        <w:tc>
+          <w:tcPr>
+            <w:tcW w:type="dxa" w:w="3312"/>
+            <w:vAlign w:val="center"/>
+          </w:tcPr>
+          <w:p>
+            <w:pPr>
+              <w:spacing w:after="40" w:before="40"/>
+            </w:pPr>
+            <w:r>
+              <w:rPr>
+                <w:sz w:val="26"/>
+              </w:rPr>
               <w:t>ระดับความพึงพอใจมากที่สุด</w:t>
             </w:r>
           </w:p>
@@ -2010,7 +2047,6 @@
           <w:tcPr>
             <w:tcW w:type="dxa" w:w="6696"/>
             <w:vAlign w:val="center"/>
-            <w:shd w:fill="F8EEF0"/>
           </w:tcPr>
           <w:p>
             <w:pPr>
@@ -2030,6 +2066,7 @@
           <w:tcPr>
             <w:tcW w:type="dxa" w:w="3312"/>
             <w:vAlign w:val="center"/>
+            <w:shd w:fill="F8EEF0"/>
           </w:tcPr>
           <w:p>
             <w:pPr>
@@ -2047,6 +2084,7 @@
           <w:tcPr>
             <w:tcW w:type="dxa" w:w="6696"/>
             <w:vAlign w:val="center"/>
+            <w:shd w:fill="F8EEF0"/>
           </w:tcPr>
           <w:p>
             <w:pPr>
@@ -2066,7 +2104,6 @@
           <w:tcPr>
             <w:tcW w:type="dxa" w:w="3312"/>
             <w:vAlign w:val="center"/>
-            <w:shd w:fill="F8EEF0"/>
           </w:tcPr>
           <w:p>
             <w:pPr>
@@ -2084,6 +2121,25 @@
           <w:tcPr>
             <w:tcW w:type="dxa" w:w="6696"/>
             <w:vAlign w:val="center"/>
+          </w:tcPr>
+          <w:p>
+            <w:pPr>
+              <w:spacing w:after="40" w:before="40"/>
+            </w:pPr>
+            <w:r>
+              <w:rPr>
+                <w:sz w:val="26"/>
+              </w:rPr>
+              <w:t>ผู้ตอบแบบประเมินมีความพึงพอใจตั้งแต่ระดับมากขึ้นไป ร้อยละ 100</w:t>
+            </w:r>
+          </w:p>
+        </w:tc>
+      </w:tr>
+      <w:tr>
+        <w:tc>
+          <w:tcPr>
+            <w:tcW w:type="dxa" w:w="3312"/>
+            <w:vAlign w:val="center"/>
             <w:shd w:fill="F8EEF0"/>
           </w:tcPr>
           <w:p>
@@ -2094,7 +2150,61 @@
               <w:rPr>
                 <w:sz w:val="26"/>
               </w:rPr>
-              <w:t>ผู้ตอบแบบประเมินมีความพึงพอใจตั้งแต่ระดับมากขึ้นไป ร้อยละ 100</w:t>
+              <w:t>การประชุมคณะกรรมการสถานศึกษา</w:t>
+            </w:r>
+          </w:p>
+        </w:tc>
+        <w:tc>
+          <w:tcPr>
+            <w:tcW w:type="dxa" w:w="6696"/>
+            <w:vAlign w:val="center"/>
+            <w:shd w:fill="F8EEF0"/>
+          </w:tcPr>
+          <w:p>
+            <w:pPr>
+              <w:spacing w:after="40" w:before="40"/>
+            </w:pPr>
+            <w:r>
+              <w:rPr>
+                <w:sz w:val="26"/>
+              </w:rPr>
+              <w:t>2 รอบ (รอบที่ 1: 20 ม.ค. 2569 เวลา 14.00 น. / รอบที่ 2: 18 มิ.ย. 2569 เวลา 17.00 น.)</w:t>
+            </w:r>
+          </w:p>
+        </w:tc>
+      </w:tr>
+      <w:tr>
+        <w:tc>
+          <w:tcPr>
+            <w:tcW w:type="dxa" w:w="3312"/>
+            <w:vAlign w:val="center"/>
+          </w:tcPr>
+          <w:p>
+            <w:pPr>
+              <w:spacing w:after="40" w:before="40"/>
+            </w:pPr>
+            <w:r>
+              <w:rPr>
+                <w:sz w:val="26"/>
+              </w:rPr>
+              <w:t>กิจกรรมวันไหว้ครู 2569</w:t>
+            </w:r>
+          </w:p>
+        </w:tc>
+        <w:tc>
+          <w:tcPr>
+            <w:tcW w:type="dxa" w:w="6696"/>
+            <w:vAlign w:val="center"/>
+          </w:tcPr>
+          <w:p>
+            <w:pPr>
+              <w:spacing w:after="40" w:before="40"/>
+            </w:pPr>
+            <w:r>
+              <w:rPr>
+                <w:sz w:val="26"/>
+              </w:rPr>
+              <w:t>จัดกิจกรรมวันไหว้ครูให้เด็ก 10-11 มิ.ย. 2569 (ครูเจมส์เป็นผู้รับผิดชอบโครงการ)</w:t>
             </w:r>
           </w:p>
         </w:tc>
@@ -2113,7 +2223,7 @@
         <w:drawing>
           <wp:inline xmlns:a="http://schemas.openxmlformats.org/drawingml/2006/main" xmlns:pic="http://schemas.openxmlformats.org/drawingml/2006/picture">
             <wp:extent cx="5029200" cy="3771900"/>
-            <wp:docPr id="3" name="Picture 3" descr="การประชุมผู้ปกครองและชุมชน"/>
+            <wp:docPr id="3" name="Picture 3" descr="การจัดประชุมผู้ปกครอง 1 รอบ ภาคเรียนที่ 1/2569"/>
             <wp:cNvGraphicFramePr>
               <a:graphicFrameLocks noChangeAspect="1"/>
             </wp:cNvGraphicFramePr>
@@ -2121,7 +2231,7 @@
               <a:graphicData uri="http://schemas.openxmlformats.org/drawingml/2006/picture">
                 <pic:pic>
                   <pic:nvPicPr>
-                    <pic:cNvPr id="0" name="06_ประชุมผู้ปกครองและชุมชน.jpg"/>
+                    <pic:cNvPr id="0" name="general_admin_parent_meeting.jpg"/>
                     <pic:cNvPicPr/>
                   </pic:nvPicPr>
                   <pic:blipFill>
@@ -2155,7 +2265,7 @@
           <w:b w:val="0"/>
           <w:sz w:val="26"/>
         </w:rPr>
-        <w:t>ภาพหลักฐาน: การประสานความร่วมมือกับผู้ปกครองและชุมชน</w:t>
+        <w:t>ภาพหลักฐาน: การจัดประชุมผู้ปกครอง 1 รอบ และการประสานความร่วมมือกับชุมชน</w:t>
       </w:r>
     </w:p>
     <w:p>

</xml_diff>